<commit_message>
[NovelOS-Fix] Loai bo hoan toan tag ky thuat PAYOFF bi sot trong van phong Chuong 35 va 36
</commit_message>
<xml_diff>
--- a/manuscript/word/volume_01/ch_035.docx
+++ b/manuscript/word/volume_01/ch_035.docx
@@ -165,7 +165,7 @@
           <w:color w:val="141414"/>
           <w:sz w:val="24"/>
         </w:rPr>
-        <w:t>word_count: 3095</w:t>
+        <w:t>word_count: 3083</w:t>
       </w:r>
     </w:p>
     <w:p>
@@ -916,21 +916,6 @@
           <w:sz w:val="24"/>
         </w:rPr>
         <w:t>Đối mặt với cột cuồng phong hung bạo đang gầm rú xé rách không gian, hiện tượng vi mô từng xuất hiện trên sân thượng tòa cao ốc từ những ngày đầu đả thông thần thức nay dưới áp lực cực hạn bỗng chốc vượt qua giới hạn phàm trần!</w:t>
-      </w:r>
-    </w:p>
-    <w:p>
-      <w:pPr>
-        <w:spacing w:line="300" w:lineRule="auto" w:after="120"/>
-        <w:ind w:firstLine="432"/>
-        <w:jc w:val="both"/>
-      </w:pPr>
-      <w:r>
-        <w:rPr>
-          <w:rFonts w:ascii="Times New Roman" w:hAnsi="Times New Roman"/>
-          <w:color w:val="141414"/>
-          <w:sz w:val="24"/>
-        </w:rPr>
-        <w:t>**PAYOFF BÙNG NỔ — KHAI MỞ NĂNG LỰC NGỰ KHÍ THỂ ĐẠO!**</w:t>
       </w:r>
     </w:p>
     <w:p>

</xml_diff>